<commit_message>
remoção de referências da introdução
remoção das referências da introdução
</commit_message>
<xml_diff>
--- a/RELATORIO_PARCIAL_PI4_V2.docx
+++ b/RELATORIO_PARCIAL_PI4_V2.docx
@@ -850,46 +850,78 @@
           <w:sz w:val="21"/>
           <w:szCs w:val="21"/>
         </w:rPr>
-        <w:t>O crédito constitui um dos principais mecanismos de desenvolvimento econômico, permitindo que indivíduos e organizações tenham acesso a recursos financeiros destinados ao consumo, investimento e expansão de suas atividades. No contexto empresarial, especialmente entre micro e pequenas empresas, o acesso ao crédito é frequentemente determinante para a manutenção das operações e para o crescimento sustentável dos negócios. Nesse cenário, a análise de risco de crédito desempenha papel fundamental nas decisões das instituições financeiras, uma vez que busca avaliar a capacidade de pagamento dos tomadores e minimizar os riscos de inadimplência (BANCO CENTRAL DO BRASIL, 2018).</w:t>
-      </w:r>
-    </w:p>
-    <w:p>
-      <w:pPr>
-        <w:pStyle w:val="NormalWeb"/>
-        <w:spacing w:line="300" w:lineRule="atLeast"/>
+        <w:t>O crédito constitui um dos principais mecanismos de desenvolvimento econômico, permitindo que indivíduos e organizações tenham acesso a recursos financeiros destinados ao consumo, investimento e expansão de suas atividades. No contexto empresarial, especialmente entre micro e pequenas empresas, o acesso ao crédito é frequentemente determinante para a manutenção das operações e para o crescimento sustentável dos negócios. Nesse cenário, a análise de risco de crédito desempenha papel fundamental nas decisões das instituições financeiras, uma vez que busca avaliar a capacidade de pagamento dos tomadores e minimizar os riscos de inadimplência</w:t>
+      </w:r>
+      <w:r>
         <w:rPr>
           <w:rFonts w:ascii="Segoe UI" w:hAnsi="Segoe UI" w:cs="Segoe UI"/>
           <w:sz w:val="21"/>
           <w:szCs w:val="21"/>
         </w:rPr>
-      </w:pPr>
-      <w:r>
+        <w:t>.</w:t>
+      </w:r>
+    </w:p>
+    <w:p>
+      <w:pPr>
+        <w:pStyle w:val="NormalWeb"/>
+        <w:spacing w:line="300" w:lineRule="atLeast"/>
         <w:rPr>
           <w:rFonts w:ascii="Segoe UI" w:hAnsi="Segoe UI" w:cs="Segoe UI"/>
           <w:sz w:val="21"/>
           <w:szCs w:val="21"/>
         </w:rPr>
-        <w:t>Com a crescente digitalização dos serviços financeiros e o aumento da disponibilidade de dados, a Ciência de Dados e a Engenharia da Computação passaram a desempenhar papel estratégico na geração de conhecimento para apoio à tomada de decisões. Técnicas de análise exploratória de dados, mineração de dados e aprendizado de máquina possibilitam identificar padrões e tendências em grandes volumes de informações, contribuindo para processos de avaliação mais eficientes e precisos (FACELI et al., 2011; FERREIRA et al., 2021).</w:t>
-      </w:r>
-    </w:p>
-    <w:p>
-      <w:pPr>
-        <w:pStyle w:val="NormalWeb"/>
-        <w:spacing w:line="300" w:lineRule="atLeast"/>
+      </w:pPr>
+      <w:r>
         <w:rPr>
           <w:rFonts w:ascii="Segoe UI" w:hAnsi="Segoe UI" w:cs="Segoe UI"/>
           <w:sz w:val="21"/>
           <w:szCs w:val="21"/>
         </w:rPr>
-      </w:pPr>
+        <w:t>Com a crescente digitalização dos serviços financeiros e o aumento da disponibilidade de dados, a Ciência de Dados e a Engenharia da Computação passaram a desempenhar papel estratégico na geração de conhecimento para apoio à tomada de decisões. Técnicas de análise exploratória de dados, mineração de dados e aprendizado de máquina possibilitam identificar padrões e tendências em grandes volumes de informações, contribuindo para processos de avaliação mais eficientes e precisos</w:t>
+      </w:r>
       <w:r>
         <w:rPr>
           <w:rFonts w:ascii="Segoe UI" w:hAnsi="Segoe UI" w:cs="Segoe UI"/>
           <w:sz w:val="21"/>
           <w:szCs w:val="21"/>
         </w:rPr>
+        <w:t>.</w:t>
+      </w:r>
+    </w:p>
+    <w:p>
+      <w:pPr>
+        <w:pStyle w:val="NormalWeb"/>
+        <w:spacing w:line="300" w:lineRule="atLeast"/>
+        <w:rPr>
+          <w:rFonts w:ascii="Segoe UI" w:hAnsi="Segoe UI" w:cs="Segoe UI"/>
+          <w:sz w:val="21"/>
+          <w:szCs w:val="21"/>
+        </w:rPr>
+      </w:pPr>
+      <w:r>
+        <w:rPr>
+          <w:rFonts w:ascii="Segoe UI" w:hAnsi="Segoe UI" w:cs="Segoe UI"/>
+          <w:sz w:val="21"/>
+          <w:szCs w:val="21"/>
+        </w:rPr>
+        <w:t xml:space="preserve">A escolha deste tema foi motivada pela relevância econômica e social do crédito e pela necessidade de ampliar a compreensão dos fatores que influenciam a concessão de </w:t>
+      </w:r>
+      <w:r>
+        <w:rPr>
+          <w:rFonts w:ascii="Segoe UI" w:hAnsi="Segoe UI" w:cs="Segoe UI"/>
+          <w:sz w:val="21"/>
+          <w:szCs w:val="21"/>
+        </w:rPr>
         <w:lastRenderedPageBreak/>
-        <w:t>A escolha deste tema foi motivada pela relevância econômica e social do crédito e pela necessidade de ampliar a compreensão dos fatores que influenciam a concessão de financiamentos, especialmente para pequenos empreendedores. Embora o acesso ao crédito seja essencial para a atividade produtiva, muitos empresários enfrentam dificuldades para compreender os critérios utilizados pelas instituições financeiras na análise de risco, o que pode limitar seu planejamento financeiro e suas possibilidades de obtenção de recursos (SEBRAE, 2021).</w:t>
+        <w:t>financiamentos, especialmente para pequenos empreendedores. Embora o acesso ao crédito seja essencial para a atividade produtiva, muitos empresários enfrentam dificuldades para compreender os critérios utilizados pelas instituições financeiras na análise de risco, o que pode limitar seu planejamento financeiro e suas possibilidades de obtenção de recursos</w:t>
+      </w:r>
+      <w:r>
+        <w:rPr>
+          <w:rFonts w:ascii="Segoe UI" w:hAnsi="Segoe UI" w:cs="Segoe UI"/>
+          <w:sz w:val="21"/>
+          <w:szCs w:val="21"/>
+        </w:rPr>
+        <w:t>.</w:t>
       </w:r>
     </w:p>
     <w:p>
@@ -1034,6 +1066,7 @@
     <w:p/>
     <w:p>
       <w:r>
+        <w:lastRenderedPageBreak/>
         <w:t>Apesar desses avanços, a concessão de crédito continua sendo um processo complexo para muitos empreendedores, principalmente em razão da pouca transparência dos critérios utilizados pelas instituições financeiras na avaliação de risco. Nesse contexto, técnicas de Ciência de Dados e Aprendizado de Máquina apresentam potencial para organizar e analisar grandes volumes de informações financeiras, permitindo a identificação de padrões e a produção de indicadores mais claros e acessíveis para a tomada de decisão (FACELI et al., 2011; FERREIRA et al., 2021).</w:t>
       </w:r>
     </w:p>
@@ -1098,15 +1131,12 @@
     </w:p>
     <w:p>
       <w:r>
-        <w:t xml:space="preserve">Além dos aspectos técnicos, é necessário considerar questões relacionadas à ética, acessibilidade, sustentabilidade, diversidade e regulamentação profissional no desenvolvimento de soluções computacionais. Esses elementos contribuem para uma utilização mais responsável dos dados e dos algoritmos em contextos reais (GARCIA, </w:t>
-      </w:r>
+        <w:t>Além dos aspectos técnicos, é necessário considerar questões relacionadas à ética, acessibilidade, sustentabilidade, diversidade e regulamentação profissional no desenvolvimento de soluções computacionais. Esses elementos contribuem para uma utilização mais responsável dos dados e dos algoritmos em contextos reais (GARCIA, 2020; FILGUEIRAS; PRIETCH; FREIRE, 2020; NERIS et al., 2020; RIBEIRO et al., 2020; BIGONHA, 2020).</w:t>
+      </w:r>
+    </w:p>
+    <w:p>
       <w:r>
         <w:lastRenderedPageBreak/>
-        <w:t>2020; FILGUEIRAS; PRIETCH; FREIRE, 2020; NERIS et al., 2020; RIBEIRO et al., 2020; BIGONHA, 2020).</w:t>
-      </w:r>
-    </w:p>
-    <w:p>
-      <w:r>
         <w:t xml:space="preserve">Trechos complementares, como o livro </w:t>
       </w:r>
       <w:r>
@@ -1709,7 +1739,7 @@
                     <pic:cNvPicPr/>
                   </pic:nvPicPr>
                   <pic:blipFill>
-                    <a:blip r:embed="rId7" cstate="print">
+                    <a:blip r:embed="rId8" cstate="print">
                       <a:extLst>
                         <a:ext uri="{28A0092B-C50C-407E-A947-70E740481C1C}">
                           <a14:useLocalDpi xmlns:a14="http://schemas.microsoft.com/office/drawing/2010/main" val="0"/>
@@ -1845,7 +1875,7 @@
                     <pic:cNvPicPr/>
                   </pic:nvPicPr>
                   <pic:blipFill>
-                    <a:blip r:embed="rId8" cstate="print">
+                    <a:blip r:embed="rId9" cstate="print">
                       <a:extLst>
                         <a:ext uri="{28A0092B-C50C-407E-A947-70E740481C1C}">
                           <a14:useLocalDpi xmlns:a14="http://schemas.microsoft.com/office/drawing/2010/main" val="0"/>
@@ -1961,7 +1991,7 @@
                     <pic:cNvPicPr/>
                   </pic:nvPicPr>
                   <pic:blipFill>
-                    <a:blip r:embed="rId9" cstate="print">
+                    <a:blip r:embed="rId10" cstate="print">
                       <a:extLst>
                         <a:ext uri="{28A0092B-C50C-407E-A947-70E740481C1C}">
                           <a14:useLocalDpi xmlns:a14="http://schemas.microsoft.com/office/drawing/2010/main" val="0"/>
@@ -2013,7 +2043,7 @@
                     <pic:cNvPicPr/>
                   </pic:nvPicPr>
                   <pic:blipFill>
-                    <a:blip r:embed="rId10" cstate="print">
+                    <a:blip r:embed="rId11" cstate="print">
                       <a:extLst>
                         <a:ext uri="{28A0092B-C50C-407E-A947-70E740481C1C}">
                           <a14:useLocalDpi xmlns:a14="http://schemas.microsoft.com/office/drawing/2010/main" val="0"/>
@@ -2068,7 +2098,7 @@
                     <pic:cNvPicPr/>
                   </pic:nvPicPr>
                   <pic:blipFill>
-                    <a:blip r:embed="rId11" cstate="print">
+                    <a:blip r:embed="rId12" cstate="print">
                       <a:extLst>
                         <a:ext uri="{28A0092B-C50C-407E-A947-70E740481C1C}">
                           <a14:useLocalDpi xmlns:a14="http://schemas.microsoft.com/office/drawing/2010/main" val="0"/>
@@ -2120,7 +2150,7 @@
                     <pic:cNvPicPr/>
                   </pic:nvPicPr>
                   <pic:blipFill>
-                    <a:blip r:embed="rId12" cstate="print">
+                    <a:blip r:embed="rId13" cstate="print">
                       <a:extLst>
                         <a:ext uri="{28A0092B-C50C-407E-A947-70E740481C1C}">
                           <a14:useLocalDpi xmlns:a14="http://schemas.microsoft.com/office/drawing/2010/main" val="0"/>
@@ -2185,7 +2215,7 @@
                     <pic:cNvPicPr/>
                   </pic:nvPicPr>
                   <pic:blipFill>
-                    <a:blip r:embed="rId13" cstate="print">
+                    <a:blip r:embed="rId14" cstate="print">
                       <a:extLst>
                         <a:ext uri="{28A0092B-C50C-407E-A947-70E740481C1C}">
                           <a14:useLocalDpi xmlns:a14="http://schemas.microsoft.com/office/drawing/2010/main" val="0"/>
@@ -2264,7 +2294,7 @@
                     <pic:cNvPicPr/>
                   </pic:nvPicPr>
                   <pic:blipFill>
-                    <a:blip r:embed="rId14" cstate="print">
+                    <a:blip r:embed="rId15" cstate="print">
                       <a:extLst>
                         <a:ext uri="{28A0092B-C50C-407E-A947-70E740481C1C}">
                           <a14:useLocalDpi xmlns:a14="http://schemas.microsoft.com/office/drawing/2010/main" val="0"/>
@@ -2332,7 +2362,7 @@
                     <pic:cNvPicPr/>
                   </pic:nvPicPr>
                   <pic:blipFill>
-                    <a:blip r:embed="rId15" cstate="print">
+                    <a:blip r:embed="rId16" cstate="print">
                       <a:extLst>
                         <a:ext uri="{28A0092B-C50C-407E-A947-70E740481C1C}">
                           <a14:useLocalDpi xmlns:a14="http://schemas.microsoft.com/office/drawing/2010/main" val="0"/>
@@ -2396,7 +2426,7 @@
                     <pic:cNvPicPr/>
                   </pic:nvPicPr>
                   <pic:blipFill>
-                    <a:blip r:embed="rId16" cstate="print">
+                    <a:blip r:embed="rId17" cstate="print">
                       <a:extLst>
                         <a:ext uri="{28A0092B-C50C-407E-A947-70E740481C1C}">
                           <a14:useLocalDpi xmlns:a14="http://schemas.microsoft.com/office/drawing/2010/main" val="0"/>
@@ -2850,7 +2880,7 @@
       </w:pPr>
     </w:p>
     <w:sectPr>
-      <w:headerReference w:type="default" r:id="rId17"/>
+      <w:headerReference w:type="default" r:id="rId18"/>
       <w:pgSz w:w="11906" w:h="16838"/>
       <w:pgMar w:top="1417" w:right="1701" w:bottom="1417" w:left="1701" w:header="708" w:footer="708" w:gutter="0"/>
       <w:cols w:space="708"/>
@@ -6442,4 +6472,16 @@
     </a:ext>
   </a:extLst>
 </a:theme>
+</file>
+
+<file path=customXml/item1.xml><?xml version="1.0" encoding="utf-8"?>
+<b:Sources xmlns:b="http://schemas.openxmlformats.org/officeDocument/2006/bibliography" xmlns="http://schemas.openxmlformats.org/officeDocument/2006/bibliography" SelectedStyle="\APASixthEditionOfficeOnline.xsl" StyleName="APA" Version="6"/>
+</file>
+
+<file path=customXml/itemProps1.xml><?xml version="1.0" encoding="utf-8"?>
+<ds:datastoreItem xmlns:ds="http://schemas.openxmlformats.org/officeDocument/2006/customXml" ds:itemID="{EDB32765-38BF-4E92-AE21-76F04E10561B}">
+  <ds:schemaRefs>
+    <ds:schemaRef ds:uri="http://schemas.openxmlformats.org/officeDocument/2006/bibliography"/>
+  </ds:schemaRefs>
+</ds:datastoreItem>
 </file>
</xml_diff>